<commit_message>
Add nnU-Net prep CLI and info pill UI
Introduces a new `voxelscout-prepare-nnunet` command to deterministically validate and prepare VerSe 2020 data for nnU-Net v2, including label remapping (28->26), holdout separation, compatibility-safe writes, and metadata outputs (`dataset.json`, `label_mapping.json`, `manifest.csv`, `preparation_summary.json`). Adds comprehensive tests for geometry/label validation, idempotency, overlap checks, dry-run behavior, and error reporting. Updates README and ignore rules for nnU-Net/dataset artifacts, and replaces the desktop tooltip with a custom floating pill overlay for vertebra info display.
</commit_message>
<xml_diff>
--- a/docs/VoxelScout.docx
+++ b/docs/VoxelScout.docx
@@ -7,7 +7,7 @@
         <w:pStyle w:val="Title"/>
         <w:jc w:val="both"/>
         <w:rPr>
-          <w:rFonts w:ascii="Franklin Gothic Book" w:hAnsi="Franklin Gothic Book" w:hint="eastAsia"/>
+          <w:rFonts w:ascii="Franklin Gothic Book" w:hAnsi="Franklin Gothic Book"/>
           <w:b/>
           <w:bCs/>
           <w:sz w:val="48"/>
@@ -391,6 +391,7 @@
       <w:sdtPr>
         <w:rPr>
           <w:rFonts w:ascii="Franklin Gothic Book" w:eastAsiaTheme="minorEastAsia" w:hAnsi="Franklin Gothic Book" w:cstheme="minorBidi"/>
+          <w:b w:val="0"/>
           <w:color w:val="auto"/>
           <w:kern w:val="2"/>
           <w:sz w:val="22"/>
@@ -1063,7 +1064,7 @@
       <w:pPr>
         <w:pStyle w:val="Heading2"/>
         <w:rPr>
-          <w:rFonts w:ascii="Franklin Gothic Book" w:eastAsiaTheme="majorEastAsia" w:hAnsi="Franklin Gothic Book" w:hint="eastAsia"/>
+          <w:rFonts w:ascii="Franklin Gothic Book" w:eastAsiaTheme="majorEastAsia" w:hAnsi="Franklin Gothic Book"/>
         </w:rPr>
       </w:pPr>
       <w:bookmarkStart w:id="3" w:name="_Toc235106185"/>
@@ -1084,7 +1085,7 @@
     <w:p>
       <w:pPr>
         <w:rPr>
-          <w:rFonts w:eastAsiaTheme="minorEastAsia" w:hint="eastAsia"/>
+          <w:rFonts w:eastAsiaTheme="minorEastAsia"/>
         </w:rPr>
       </w:pPr>
       <w:r>
@@ -1170,7 +1171,7 @@
     <w:p>
       <w:pPr>
         <w:rPr>
-          <w:rFonts w:eastAsiaTheme="minorEastAsia" w:hint="eastAsia"/>
+          <w:rFonts w:eastAsiaTheme="minorEastAsia"/>
         </w:rPr>
       </w:pPr>
     </w:p>
@@ -1192,47 +1193,47 @@
           <w:p>
             <w:pPr>
               <w:rPr>
+                <w:rFonts w:eastAsiaTheme="minorEastAsia"/>
+                <w:b/>
+                <w:bCs/>
+              </w:rPr>
+            </w:pPr>
+            <w:r>
+              <w:rPr>
                 <w:rFonts w:eastAsiaTheme="minorEastAsia" w:hint="eastAsia"/>
                 <w:b/>
                 <w:bCs/>
               </w:rPr>
-            </w:pPr>
-            <w:r>
-              <w:rPr>
-                <w:rFonts w:eastAsiaTheme="minorEastAsia" w:hint="eastAsia"/>
+              <w:t>Abbreviation</w:t>
+            </w:r>
+            <w:r>
+              <w:rPr>
+                <w:rFonts w:eastAsiaTheme="minorEastAsia"/>
                 <w:b/>
                 <w:bCs/>
               </w:rPr>
-              <w:t>Abbreviation</w:t>
-            </w:r>
-            <w:r>
+              <w:t>/Term</w:t>
+            </w:r>
+          </w:p>
+        </w:tc>
+        <w:tc>
+          <w:tcPr>
+            <w:tcW w:w="7796" w:type="dxa"/>
+          </w:tcPr>
+          <w:p>
+            <w:pPr>
               <w:rPr>
                 <w:rFonts w:eastAsiaTheme="minorEastAsia"/>
                 <w:b/>
                 <w:bCs/>
               </w:rPr>
-              <w:t>/Term</w:t>
-            </w:r>
-          </w:p>
-        </w:tc>
-        <w:tc>
-          <w:tcPr>
-            <w:tcW w:w="7796" w:type="dxa"/>
-          </w:tcPr>
-          <w:p>
-            <w:pPr>
+            </w:pPr>
+            <w:r>
               <w:rPr>
                 <w:rFonts w:eastAsiaTheme="minorEastAsia"/>
                 <w:b/>
                 <w:bCs/>
               </w:rPr>
-            </w:pPr>
-            <w:r>
-              <w:rPr>
-                <w:rFonts w:eastAsiaTheme="minorEastAsia"/>
-                <w:b/>
-                <w:bCs/>
-              </w:rPr>
               <w:t>Meaning</w:t>
             </w:r>
           </w:p>
@@ -1336,7 +1337,7 @@
           <w:p>
             <w:pPr>
               <w:rPr>
-                <w:rFonts w:eastAsiaTheme="minorEastAsia" w:hint="eastAsia"/>
+                <w:rFonts w:eastAsiaTheme="minorEastAsia"/>
               </w:rPr>
             </w:pPr>
             <w:r>
@@ -1366,7 +1367,7 @@
           <w:p>
             <w:pPr>
               <w:rPr>
-                <w:rFonts w:eastAsiaTheme="minorEastAsia" w:hint="eastAsia"/>
+                <w:rFonts w:eastAsiaTheme="minorEastAsia"/>
               </w:rPr>
             </w:pPr>
           </w:p>
@@ -1378,7 +1379,7 @@
           <w:p>
             <w:pPr>
               <w:rPr>
-                <w:rFonts w:eastAsiaTheme="minorEastAsia" w:hint="eastAsia"/>
+                <w:rFonts w:eastAsiaTheme="minorEastAsia"/>
               </w:rPr>
             </w:pPr>
           </w:p>
@@ -1418,7 +1419,7 @@
       <w:pPr>
         <w:pStyle w:val="Heading2"/>
         <w:rPr>
-          <w:rFonts w:ascii="Franklin Gothic Book" w:eastAsiaTheme="majorEastAsia" w:hAnsi="Franklin Gothic Book" w:hint="eastAsia"/>
+          <w:rFonts w:ascii="Franklin Gothic Book" w:eastAsiaTheme="majorEastAsia" w:hAnsi="Franklin Gothic Book"/>
         </w:rPr>
       </w:pPr>
       <w:bookmarkStart w:id="6" w:name="_Toc235106188"/>
@@ -1439,216 +1440,230 @@
     <w:p>
       <w:pPr>
         <w:rPr>
+          <w:rFonts w:eastAsiaTheme="minorEastAsia"/>
+          <w:lang w:val="en-US"/>
+        </w:rPr>
+      </w:pPr>
+      <w:r>
+        <w:rPr>
+          <w:rFonts w:eastAsiaTheme="minorEastAsia"/>
+        </w:rPr>
+        <w:t xml:space="preserve">Medical imaging </w:t>
+      </w:r>
+      <w:r>
+        <w:rPr>
+          <w:rFonts w:eastAsiaTheme="minorEastAsia" w:hint="eastAsia"/>
+        </w:rPr>
+        <w:t>data</w:t>
+      </w:r>
+      <w:r>
+        <w:rPr>
+          <w:rFonts w:eastAsiaTheme="minorEastAsia"/>
+        </w:rPr>
+        <w:t xml:space="preserve"> are commonly stored in specialist formats</w:t>
+      </w:r>
+      <w:r>
+        <w:rPr>
+          <w:rFonts w:eastAsiaTheme="minorEastAsia" w:hint="eastAsia"/>
+        </w:rPr>
+        <w:t xml:space="preserve"> such as DICOM folders, </w:t>
+      </w:r>
+      <w:proofErr w:type="spellStart"/>
+      <w:r>
+        <w:rPr>
+          <w:rFonts w:eastAsiaTheme="minorEastAsia" w:hint="eastAsia"/>
+        </w:rPr>
+        <w:t>NIfTI</w:t>
+      </w:r>
+      <w:proofErr w:type="spellEnd"/>
+      <w:r>
+        <w:rPr>
+          <w:rFonts w:eastAsiaTheme="minorEastAsia" w:hint="eastAsia"/>
+        </w:rPr>
+        <w:t xml:space="preserve"> volumes and etc. None of which can be interpreted easily using standard consumer </w:t>
+      </w:r>
+      <w:r>
+        <w:rPr>
+          <w:rFonts w:eastAsiaTheme="minorEastAsia"/>
+        </w:rPr>
+        <w:t>software</w:t>
+      </w:r>
+      <w:r>
+        <w:rPr>
+          <w:rFonts w:eastAsiaTheme="minorEastAsia" w:hint="eastAsia"/>
+        </w:rPr>
+        <w:t>.</w:t>
+      </w:r>
+      <w:r>
+        <w:rPr>
+          <w:rFonts w:eastAsiaTheme="minorEastAsia" w:hint="eastAsia"/>
+        </w:rPr>
+        <w:t xml:space="preserve"> </w:t>
+      </w:r>
+      <w:r>
+        <w:rPr>
+          <w:rFonts w:eastAsiaTheme="minorEastAsia" w:hint="eastAsia"/>
+        </w:rPr>
+        <w:t>E</w:t>
+      </w:r>
+      <w:r>
+        <w:rPr>
+          <w:rFonts w:eastAsiaTheme="minorEastAsia" w:hint="eastAsia"/>
+        </w:rPr>
+        <w:t xml:space="preserve">ven when </w:t>
+      </w:r>
+      <w:r>
+        <w:rPr>
+          <w:rFonts w:eastAsiaTheme="minorEastAsia" w:hint="eastAsia"/>
+        </w:rPr>
+        <w:t xml:space="preserve">some </w:t>
+      </w:r>
+      <w:r>
+        <w:rPr>
+          <w:rFonts w:eastAsiaTheme="minorEastAsia" w:hint="eastAsia"/>
+        </w:rPr>
+        <w:t>professional</w:t>
+      </w:r>
+      <w:r>
+        <w:rPr>
+          <w:rFonts w:eastAsiaTheme="minorEastAsia" w:hint="eastAsia"/>
+        </w:rPr>
+        <w:t xml:space="preserve"> </w:t>
+      </w:r>
+      <w:r>
+        <w:rPr>
+          <w:rFonts w:eastAsiaTheme="minorEastAsia" w:hint="eastAsia"/>
+        </w:rPr>
+        <w:t xml:space="preserve">imaging software such as </w:t>
+      </w:r>
+      <w:proofErr w:type="spellStart"/>
+      <w:r>
+        <w:rPr>
+          <w:rFonts w:eastAsiaTheme="minorEastAsia" w:hint="eastAsia"/>
+        </w:rPr>
+        <w:t>MicroDicom</w:t>
+      </w:r>
+      <w:proofErr w:type="spellEnd"/>
+      <w:r>
+        <w:rPr>
+          <w:rFonts w:eastAsiaTheme="minorEastAsia" w:hint="eastAsia"/>
+        </w:rPr>
+        <w:t>,</w:t>
+      </w:r>
+      <w:r>
+        <w:rPr>
+          <w:rFonts w:eastAsiaTheme="minorEastAsia" w:hint="eastAsia"/>
+        </w:rPr>
+        <w:t xml:space="preserve"> </w:t>
+      </w:r>
+      <w:proofErr w:type="spellStart"/>
+      <w:r>
+        <w:rPr>
+          <w:rFonts w:eastAsiaTheme="minorEastAsia" w:hint="eastAsia"/>
+        </w:rPr>
+        <w:t>RadAntViewer</w:t>
+      </w:r>
+      <w:proofErr w:type="spellEnd"/>
+      <w:r>
+        <w:rPr>
+          <w:rFonts w:eastAsiaTheme="minorEastAsia" w:hint="eastAsia"/>
+        </w:rPr>
+        <w:t xml:space="preserve"> and ImageJ</w:t>
+      </w:r>
+      <w:r>
+        <w:rPr>
+          <w:rFonts w:eastAsiaTheme="minorEastAsia" w:hint="eastAsia"/>
+        </w:rPr>
+        <w:t xml:space="preserve"> are available, the interface is </w:t>
+      </w:r>
+      <w:r>
+        <w:rPr>
+          <w:rFonts w:eastAsiaTheme="minorEastAsia"/>
+        </w:rPr>
+        <w:t>designed</w:t>
+      </w:r>
+      <w:r>
+        <w:rPr>
+          <w:rFonts w:eastAsiaTheme="minorEastAsia" w:hint="eastAsia"/>
+        </w:rPr>
+        <w:t xml:space="preserve"> for</w:t>
+      </w:r>
+      <w:r>
+        <w:rPr>
+          <w:rFonts w:eastAsiaTheme="minorEastAsia" w:hint="eastAsia"/>
+        </w:rPr>
+        <w:t xml:space="preserve"> specialists. </w:t>
+      </w:r>
+      <w:r>
+        <w:rPr>
+          <w:rFonts w:eastAsiaTheme="minorEastAsia" w:hint="eastAsia"/>
+        </w:rPr>
+        <w:t xml:space="preserve">Using </w:t>
+      </w:r>
+      <w:r>
+        <w:rPr>
+          <w:rFonts w:eastAsiaTheme="minorEastAsia" w:hint="eastAsia"/>
+        </w:rPr>
+        <w:t>software as such</w:t>
+      </w:r>
+      <w:r>
+        <w:rPr>
+          <w:rFonts w:eastAsiaTheme="minorEastAsia" w:hint="eastAsia"/>
+        </w:rPr>
+        <w:t xml:space="preserve"> effectively may also require knowledge of medical image parameters such as Hounsfield units, window levels, voxel spacing and image orientation, as well as basic anatomical knowledge such as the regions of the spine and the meaning of individual vertebral labels. </w:t>
+      </w:r>
+      <w:r>
+        <w:rPr>
+          <w:rFonts w:eastAsiaTheme="minorEastAsia" w:hint="eastAsia"/>
+        </w:rPr>
+        <w:t xml:space="preserve">Furthermore, users may have to switch between multiple software in order to </w:t>
+      </w:r>
+      <w:r>
+        <w:rPr>
+          <w:rFonts w:eastAsiaTheme="minorEastAsia"/>
+        </w:rPr>
+        <w:t>accomplish</w:t>
+      </w:r>
+      <w:r>
+        <w:rPr>
+          <w:rFonts w:eastAsiaTheme="minorEastAsia" w:hint="eastAsia"/>
+        </w:rPr>
+        <w:t xml:space="preserve"> a simple task.</w:t>
+      </w:r>
+      <w:r>
+        <w:rPr>
+          <w:rFonts w:eastAsiaTheme="minorEastAsia"/>
+          <w:lang w:val="en-US"/>
+        </w:rPr>
+        <w:t xml:space="preserve"> This level of complexity is unnecessary</w:t>
+      </w:r>
+      <w:r>
+        <w:rPr>
           <w:rFonts w:eastAsiaTheme="minorEastAsia" w:hint="eastAsia"/>
           <w:lang w:val="en-US"/>
         </w:rPr>
-      </w:pPr>
-      <w:r>
-        <w:rPr>
-          <w:rFonts w:eastAsiaTheme="minorEastAsia"/>
-        </w:rPr>
-        <w:t xml:space="preserve">Medical imaging </w:t>
-      </w:r>
-      <w:r>
-        <w:rPr>
-          <w:rFonts w:eastAsiaTheme="minorEastAsia" w:hint="eastAsia"/>
-        </w:rPr>
-        <w:t>data</w:t>
-      </w:r>
-      <w:r>
-        <w:rPr>
-          <w:rFonts w:eastAsiaTheme="minorEastAsia"/>
-        </w:rPr>
-        <w:t xml:space="preserve"> are commonly stored in specialist formats</w:t>
-      </w:r>
-      <w:r>
-        <w:rPr>
-          <w:rFonts w:eastAsiaTheme="minorEastAsia" w:hint="eastAsia"/>
-        </w:rPr>
-        <w:t xml:space="preserve"> such as DICOM folders, </w:t>
-      </w:r>
-      <w:proofErr w:type="spellStart"/>
-      <w:r>
-        <w:rPr>
-          <w:rFonts w:eastAsiaTheme="minorEastAsia" w:hint="eastAsia"/>
-        </w:rPr>
-        <w:t>NIfTI</w:t>
-      </w:r>
-      <w:proofErr w:type="spellEnd"/>
-      <w:r>
-        <w:rPr>
-          <w:rFonts w:eastAsiaTheme="minorEastAsia" w:hint="eastAsia"/>
-        </w:rPr>
-        <w:t xml:space="preserve"> volumes and etc. None of which can be interpreted easily using standard consumer </w:t>
-      </w:r>
-      <w:r>
-        <w:rPr>
-          <w:rFonts w:eastAsiaTheme="minorEastAsia"/>
-        </w:rPr>
-        <w:t>software</w:t>
-      </w:r>
-      <w:r>
-        <w:rPr>
-          <w:rFonts w:eastAsiaTheme="minorEastAsia" w:hint="eastAsia"/>
-        </w:rPr>
-        <w:t>.</w:t>
-      </w:r>
-      <w:r>
-        <w:rPr>
-          <w:rFonts w:eastAsiaTheme="minorEastAsia" w:hint="eastAsia"/>
-        </w:rPr>
-        <w:t xml:space="preserve"> </w:t>
-      </w:r>
-      <w:r>
-        <w:rPr>
-          <w:rFonts w:eastAsiaTheme="minorEastAsia" w:hint="eastAsia"/>
-        </w:rPr>
-        <w:t>E</w:t>
-      </w:r>
-      <w:r>
-        <w:rPr>
-          <w:rFonts w:eastAsiaTheme="minorEastAsia" w:hint="eastAsia"/>
-        </w:rPr>
-        <w:t xml:space="preserve">ven when </w:t>
-      </w:r>
-      <w:r>
-        <w:rPr>
-          <w:rFonts w:eastAsiaTheme="minorEastAsia" w:hint="eastAsia"/>
-        </w:rPr>
-        <w:t xml:space="preserve">some </w:t>
-      </w:r>
-      <w:r>
-        <w:rPr>
-          <w:rFonts w:eastAsiaTheme="minorEastAsia" w:hint="eastAsia"/>
-        </w:rPr>
-        <w:t>professional</w:t>
-      </w:r>
-      <w:r>
-        <w:rPr>
-          <w:rFonts w:eastAsiaTheme="minorEastAsia" w:hint="eastAsia"/>
-        </w:rPr>
-        <w:t xml:space="preserve"> </w:t>
-      </w:r>
-      <w:r>
-        <w:rPr>
-          <w:rFonts w:eastAsiaTheme="minorEastAsia" w:hint="eastAsia"/>
-        </w:rPr>
-        <w:t xml:space="preserve">imaging software such as </w:t>
-      </w:r>
-      <w:proofErr w:type="spellStart"/>
-      <w:r>
-        <w:rPr>
-          <w:rFonts w:eastAsiaTheme="minorEastAsia" w:hint="eastAsia"/>
-        </w:rPr>
-        <w:t>MicroDicom</w:t>
-      </w:r>
-      <w:proofErr w:type="spellEnd"/>
-      <w:r>
-        <w:rPr>
-          <w:rFonts w:eastAsiaTheme="minorEastAsia" w:hint="eastAsia"/>
-        </w:rPr>
-        <w:t>,</w:t>
-      </w:r>
-      <w:r>
-        <w:rPr>
-          <w:rFonts w:eastAsiaTheme="minorEastAsia" w:hint="eastAsia"/>
-        </w:rPr>
-        <w:t xml:space="preserve"> </w:t>
-      </w:r>
-      <w:proofErr w:type="spellStart"/>
-      <w:r>
-        <w:rPr>
-          <w:rFonts w:eastAsiaTheme="minorEastAsia" w:hint="eastAsia"/>
-        </w:rPr>
-        <w:t>RadAntViewer</w:t>
-      </w:r>
-      <w:proofErr w:type="spellEnd"/>
-      <w:r>
-        <w:rPr>
-          <w:rFonts w:eastAsiaTheme="minorEastAsia" w:hint="eastAsia"/>
-        </w:rPr>
-        <w:t xml:space="preserve"> and ImageJ</w:t>
-      </w:r>
-      <w:r>
-        <w:rPr>
-          <w:rFonts w:eastAsiaTheme="minorEastAsia" w:hint="eastAsia"/>
-        </w:rPr>
-        <w:t xml:space="preserve"> are available, the interface is </w:t>
-      </w:r>
-      <w:r>
-        <w:rPr>
-          <w:rFonts w:eastAsiaTheme="minorEastAsia"/>
-        </w:rPr>
-        <w:t>designed</w:t>
-      </w:r>
-      <w:r>
-        <w:rPr>
-          <w:rFonts w:eastAsiaTheme="minorEastAsia" w:hint="eastAsia"/>
-        </w:rPr>
-        <w:t xml:space="preserve"> for</w:t>
-      </w:r>
-      <w:r>
-        <w:rPr>
-          <w:rFonts w:eastAsiaTheme="minorEastAsia" w:hint="eastAsia"/>
-        </w:rPr>
-        <w:t xml:space="preserve"> specialists. </w:t>
-      </w:r>
-      <w:r>
-        <w:rPr>
-          <w:rFonts w:eastAsiaTheme="minorEastAsia" w:hint="eastAsia"/>
-        </w:rPr>
-        <w:t xml:space="preserve">Using </w:t>
-      </w:r>
-      <w:r>
-        <w:rPr>
-          <w:rFonts w:eastAsiaTheme="minorEastAsia" w:hint="eastAsia"/>
-        </w:rPr>
-        <w:t>software as such</w:t>
-      </w:r>
-      <w:r>
-        <w:rPr>
-          <w:rFonts w:eastAsiaTheme="minorEastAsia" w:hint="eastAsia"/>
-        </w:rPr>
-        <w:t xml:space="preserve"> effectively may also require knowledge of medical image parameters such as Hounsfield units, window levels, voxel spacing and image orientation, as well as basic anatomical knowledge such as the regions of the spine and the meaning of individual vertebral labels. </w:t>
-      </w:r>
-      <w:r>
-        <w:rPr>
-          <w:rFonts w:eastAsiaTheme="minorEastAsia" w:hint="eastAsia"/>
-        </w:rPr>
-        <w:t xml:space="preserve">Furthermore, users may have to switch between multiple software in order to </w:t>
-      </w:r>
-      <w:r>
-        <w:rPr>
-          <w:rFonts w:eastAsiaTheme="minorEastAsia"/>
-        </w:rPr>
-        <w:t>accomplish</w:t>
-      </w:r>
-      <w:r>
-        <w:rPr>
-          <w:rFonts w:eastAsiaTheme="minorEastAsia" w:hint="eastAsia"/>
-        </w:rPr>
-        <w:t xml:space="preserve"> a simple task.</w:t>
+        <w:t xml:space="preserve"> and inefficient</w:t>
       </w:r>
       <w:r>
         <w:rPr>
           <w:rFonts w:eastAsiaTheme="minorEastAsia"/>
           <w:lang w:val="en-US"/>
         </w:rPr>
-        <w:t xml:space="preserve"> This level of complexity is unnecessary</w:t>
-      </w:r>
-      <w:r>
-        <w:rPr>
-          <w:rFonts w:eastAsiaTheme="minorEastAsia" w:hint="eastAsia"/>
-          <w:lang w:val="en-US"/>
-        </w:rPr>
-        <w:t xml:space="preserve"> and inefficient</w:t>
+        <w:t xml:space="preserve"> for a user who rarely uses service</w:t>
       </w:r>
       <w:r>
         <w:rPr>
           <w:rFonts w:eastAsiaTheme="minorEastAsia"/>
           <w:lang w:val="en-US"/>
         </w:rPr>
-        <w:t xml:space="preserve"> for a user who rarely uses the service and </w:t>
+        <w:t>s of this sort</w:t>
+      </w:r>
+      <w:r>
+        <w:rPr>
+          <w:rFonts w:eastAsiaTheme="minorEastAsia"/>
+          <w:lang w:val="en-US"/>
+        </w:rPr>
+        <w:t xml:space="preserve"> and </w:t>
       </w:r>
       <w:r>
         <w:rPr>
@@ -1727,10 +1742,32 @@
           <w:p>
             <w:pPr>
               <w:rPr>
+                <w:rFonts w:eastAsiaTheme="minorEastAsia"/>
+                <w:b/>
+                <w:bCs/>
+              </w:rPr>
+            </w:pPr>
+            <w:r>
+              <w:rPr>
                 <w:rFonts w:eastAsiaTheme="minorEastAsia" w:hint="eastAsia"/>
                 <w:b/>
                 <w:bCs/>
               </w:rPr>
+              <w:t>Stakeholder</w:t>
+            </w:r>
+          </w:p>
+        </w:tc>
+        <w:tc>
+          <w:tcPr>
+            <w:tcW w:w="7649" w:type="dxa"/>
+          </w:tcPr>
+          <w:p>
+            <w:pPr>
+              <w:rPr>
+                <w:rFonts w:eastAsiaTheme="minorEastAsia"/>
+                <w:b/>
+                <w:bCs/>
+              </w:rPr>
             </w:pPr>
             <w:r>
               <w:rPr>
@@ -1738,28 +1775,6 @@
                 <w:b/>
                 <w:bCs/>
               </w:rPr>
-              <w:t>Stakeholder</w:t>
-            </w:r>
-          </w:p>
-        </w:tc>
-        <w:tc>
-          <w:tcPr>
-            <w:tcW w:w="7649" w:type="dxa"/>
-          </w:tcPr>
-          <w:p>
-            <w:pPr>
-              <w:rPr>
-                <w:rFonts w:eastAsiaTheme="minorEastAsia" w:hint="eastAsia"/>
-                <w:b/>
-                <w:bCs/>
-              </w:rPr>
-            </w:pPr>
-            <w:r>
-              <w:rPr>
-                <w:rFonts w:eastAsiaTheme="minorEastAsia" w:hint="eastAsia"/>
-                <w:b/>
-                <w:bCs/>
-              </w:rPr>
               <w:t>Key Needs</w:t>
             </w:r>
           </w:p>
@@ -1773,13 +1788,13 @@
           <w:p>
             <w:pPr>
               <w:rPr>
+                <w:rFonts w:eastAsiaTheme="minorEastAsia"/>
+              </w:rPr>
+            </w:pPr>
+            <w:r>
+              <w:rPr>
                 <w:rFonts w:eastAsiaTheme="minorEastAsia" w:hint="eastAsia"/>
               </w:rPr>
-            </w:pPr>
-            <w:r>
-              <w:rPr>
-                <w:rFonts w:eastAsiaTheme="minorEastAsia" w:hint="eastAsia"/>
-              </w:rPr>
               <w:t>Technical Users New to Medical Imaging</w:t>
             </w:r>
           </w:p>
@@ -1791,7 +1806,7 @@
           <w:p>
             <w:pPr>
               <w:rPr>
-                <w:rFonts w:eastAsiaTheme="minorEastAsia" w:hint="eastAsia"/>
+                <w:rFonts w:eastAsiaTheme="minorEastAsia"/>
               </w:rPr>
             </w:pPr>
             <w:r>
@@ -1811,7 +1826,7 @@
           <w:p>
             <w:pPr>
               <w:rPr>
-                <w:rFonts w:eastAsiaTheme="minorEastAsia" w:hint="eastAsia"/>
+                <w:rFonts w:eastAsiaTheme="minorEastAsia"/>
               </w:rPr>
             </w:pPr>
             <w:r>
@@ -1830,7 +1845,7 @@
           <w:p>
             <w:pPr>
               <w:rPr>
-                <w:rFonts w:eastAsiaTheme="minorEastAsia" w:hint="eastAsia"/>
+                <w:rFonts w:eastAsiaTheme="minorEastAsia"/>
               </w:rPr>
             </w:pPr>
             <w:r>
@@ -1850,13 +1865,13 @@
           <w:p>
             <w:pPr>
               <w:rPr>
+                <w:rFonts w:eastAsiaTheme="minorEastAsia"/>
+              </w:rPr>
+            </w:pPr>
+            <w:r>
+              <w:rPr>
                 <w:rFonts w:eastAsiaTheme="minorEastAsia" w:hint="eastAsia"/>
               </w:rPr>
-            </w:pPr>
-            <w:r>
-              <w:rPr>
-                <w:rFonts w:eastAsiaTheme="minorEastAsia" w:hint="eastAsia"/>
-              </w:rPr>
               <w:t>Medical Students</w:t>
             </w:r>
           </w:p>
@@ -1868,7 +1883,7 @@
           <w:p>
             <w:pPr>
               <w:rPr>
-                <w:rFonts w:eastAsiaTheme="minorEastAsia" w:hint="eastAsia"/>
+                <w:rFonts w:eastAsiaTheme="minorEastAsia"/>
               </w:rPr>
             </w:pPr>
             <w:r>
@@ -1884,7 +1899,7 @@
     <w:p>
       <w:pPr>
         <w:rPr>
-          <w:rFonts w:eastAsiaTheme="minorEastAsia" w:hint="eastAsia"/>
+          <w:rFonts w:eastAsiaTheme="minorEastAsia"/>
         </w:rPr>
       </w:pPr>
     </w:p>
@@ -1892,7 +1907,7 @@
       <w:pPr>
         <w:pStyle w:val="Heading2"/>
         <w:rPr>
-          <w:rFonts w:ascii="Franklin Gothic Book" w:eastAsiaTheme="minorEastAsia" w:hAnsi="Franklin Gothic Book" w:hint="eastAsia"/>
+          <w:rFonts w:ascii="Franklin Gothic Book" w:eastAsiaTheme="minorEastAsia" w:hAnsi="Franklin Gothic Book"/>
         </w:rPr>
       </w:pPr>
       <w:bookmarkStart w:id="8" w:name="_Toc235106190"/>
@@ -1940,10 +1955,32 @@
           <w:p>
             <w:pPr>
               <w:rPr>
+                <w:rFonts w:eastAsiaTheme="minorEastAsia"/>
+                <w:b/>
+                <w:bCs/>
+              </w:rPr>
+            </w:pPr>
+            <w:r>
+              <w:rPr>
                 <w:rFonts w:eastAsiaTheme="minorEastAsia" w:hint="eastAsia"/>
                 <w:b/>
                 <w:bCs/>
               </w:rPr>
+              <w:t>ID</w:t>
+            </w:r>
+          </w:p>
+        </w:tc>
+        <w:tc>
+          <w:tcPr>
+            <w:tcW w:w="8890" w:type="dxa"/>
+          </w:tcPr>
+          <w:p>
+            <w:pPr>
+              <w:rPr>
+                <w:rFonts w:eastAsiaTheme="minorEastAsia"/>
+                <w:b/>
+                <w:bCs/>
+              </w:rPr>
             </w:pPr>
             <w:r>
               <w:rPr>
@@ -1951,28 +1988,6 @@
                 <w:b/>
                 <w:bCs/>
               </w:rPr>
-              <w:t>ID</w:t>
-            </w:r>
-          </w:p>
-        </w:tc>
-        <w:tc>
-          <w:tcPr>
-            <w:tcW w:w="8890" w:type="dxa"/>
-          </w:tcPr>
-          <w:p>
-            <w:pPr>
-              <w:rPr>
-                <w:rFonts w:eastAsiaTheme="minorEastAsia" w:hint="eastAsia"/>
-                <w:b/>
-                <w:bCs/>
-              </w:rPr>
-            </w:pPr>
-            <w:r>
-              <w:rPr>
-                <w:rFonts w:eastAsiaTheme="minorEastAsia" w:hint="eastAsia"/>
-                <w:b/>
-                <w:bCs/>
-              </w:rPr>
               <w:t>Requirement</w:t>
             </w:r>
           </w:p>
@@ -1986,13 +2001,13 @@
           <w:p>
             <w:pPr>
               <w:rPr>
+                <w:rFonts w:eastAsiaTheme="minorEastAsia"/>
+              </w:rPr>
+            </w:pPr>
+            <w:r>
+              <w:rPr>
                 <w:rFonts w:eastAsiaTheme="minorEastAsia" w:hint="eastAsia"/>
               </w:rPr>
-            </w:pPr>
-            <w:r>
-              <w:rPr>
-                <w:rFonts w:eastAsiaTheme="minorEastAsia" w:hint="eastAsia"/>
-              </w:rPr>
               <w:t>CR1</w:t>
             </w:r>
           </w:p>
@@ -2004,7 +2019,7 @@
           <w:p>
             <w:pPr>
               <w:rPr>
-                <w:rFonts w:eastAsiaTheme="minorEastAsia" w:hint="eastAsia"/>
+                <w:rFonts w:eastAsiaTheme="minorEastAsia"/>
               </w:rPr>
             </w:pPr>
             <w:r>
@@ -2024,13 +2039,13 @@
           <w:p>
             <w:pPr>
               <w:rPr>
+                <w:rFonts w:eastAsiaTheme="minorEastAsia"/>
+              </w:rPr>
+            </w:pPr>
+            <w:r>
+              <w:rPr>
                 <w:rFonts w:eastAsiaTheme="minorEastAsia" w:hint="eastAsia"/>
               </w:rPr>
-            </w:pPr>
-            <w:r>
-              <w:rPr>
-                <w:rFonts w:eastAsiaTheme="minorEastAsia" w:hint="eastAsia"/>
-              </w:rPr>
               <w:t>CR2</w:t>
             </w:r>
           </w:p>
@@ -2042,7 +2057,7 @@
           <w:p>
             <w:pPr>
               <w:rPr>
-                <w:rFonts w:eastAsiaTheme="minorEastAsia" w:hint="eastAsia"/>
+                <w:rFonts w:eastAsiaTheme="minorEastAsia"/>
               </w:rPr>
             </w:pPr>
             <w:r>
@@ -2062,13 +2077,13 @@
           <w:p>
             <w:pPr>
               <w:rPr>
+                <w:rFonts w:eastAsiaTheme="minorEastAsia"/>
+              </w:rPr>
+            </w:pPr>
+            <w:r>
+              <w:rPr>
                 <w:rFonts w:eastAsiaTheme="minorEastAsia" w:hint="eastAsia"/>
               </w:rPr>
-            </w:pPr>
-            <w:r>
-              <w:rPr>
-                <w:rFonts w:eastAsiaTheme="minorEastAsia" w:hint="eastAsia"/>
-              </w:rPr>
               <w:t>CR3</w:t>
             </w:r>
           </w:p>
@@ -2080,7 +2095,7 @@
           <w:p>
             <w:pPr>
               <w:rPr>
-                <w:rFonts w:eastAsiaTheme="minorEastAsia" w:hint="eastAsia"/>
+                <w:rFonts w:eastAsiaTheme="minorEastAsia"/>
               </w:rPr>
             </w:pPr>
             <w:r>
@@ -2100,13 +2115,13 @@
           <w:p>
             <w:pPr>
               <w:rPr>
+                <w:rFonts w:eastAsiaTheme="minorEastAsia"/>
+              </w:rPr>
+            </w:pPr>
+            <w:r>
+              <w:rPr>
                 <w:rFonts w:eastAsiaTheme="minorEastAsia" w:hint="eastAsia"/>
               </w:rPr>
-            </w:pPr>
-            <w:r>
-              <w:rPr>
-                <w:rFonts w:eastAsiaTheme="minorEastAsia" w:hint="eastAsia"/>
-              </w:rPr>
               <w:t>CR4</w:t>
             </w:r>
           </w:p>
@@ -2118,7 +2133,7 @@
           <w:p>
             <w:pPr>
               <w:rPr>
-                <w:rFonts w:eastAsiaTheme="minorEastAsia" w:hint="eastAsia"/>
+                <w:rFonts w:eastAsiaTheme="minorEastAsia"/>
               </w:rPr>
             </w:pPr>
             <w:r>
@@ -2138,13 +2153,13 @@
           <w:p>
             <w:pPr>
               <w:rPr>
+                <w:rFonts w:eastAsiaTheme="minorEastAsia"/>
+              </w:rPr>
+            </w:pPr>
+            <w:r>
+              <w:rPr>
                 <w:rFonts w:eastAsiaTheme="minorEastAsia" w:hint="eastAsia"/>
               </w:rPr>
-            </w:pPr>
-            <w:r>
-              <w:rPr>
-                <w:rFonts w:eastAsiaTheme="minorEastAsia" w:hint="eastAsia"/>
-              </w:rPr>
               <w:t>CR5</w:t>
             </w:r>
           </w:p>
@@ -2156,7 +2171,7 @@
           <w:p>
             <w:pPr>
               <w:rPr>
-                <w:rFonts w:eastAsiaTheme="minorEastAsia" w:hint="eastAsia"/>
+                <w:rFonts w:eastAsiaTheme="minorEastAsia"/>
               </w:rPr>
             </w:pPr>
             <w:r>
@@ -2176,13 +2191,13 @@
           <w:p>
             <w:pPr>
               <w:rPr>
+                <w:rFonts w:eastAsiaTheme="minorEastAsia"/>
+              </w:rPr>
+            </w:pPr>
+            <w:r>
+              <w:rPr>
                 <w:rFonts w:eastAsiaTheme="minorEastAsia" w:hint="eastAsia"/>
               </w:rPr>
-            </w:pPr>
-            <w:r>
-              <w:rPr>
-                <w:rFonts w:eastAsiaTheme="minorEastAsia" w:hint="eastAsia"/>
-              </w:rPr>
               <w:t>CR6</w:t>
             </w:r>
           </w:p>
@@ -2194,7 +2209,7 @@
           <w:p>
             <w:pPr>
               <w:rPr>
-                <w:rFonts w:eastAsiaTheme="minorEastAsia" w:hint="eastAsia"/>
+                <w:rFonts w:eastAsiaTheme="minorEastAsia"/>
               </w:rPr>
             </w:pPr>
             <w:r>
@@ -2214,13 +2229,13 @@
           <w:p>
             <w:pPr>
               <w:rPr>
+                <w:rFonts w:eastAsiaTheme="minorEastAsia"/>
+              </w:rPr>
+            </w:pPr>
+            <w:r>
+              <w:rPr>
                 <w:rFonts w:eastAsiaTheme="minorEastAsia" w:hint="eastAsia"/>
               </w:rPr>
-            </w:pPr>
-            <w:r>
-              <w:rPr>
-                <w:rFonts w:eastAsiaTheme="minorEastAsia" w:hint="eastAsia"/>
-              </w:rPr>
               <w:t>CR7</w:t>
             </w:r>
           </w:p>
@@ -2232,7 +2247,7 @@
           <w:p>
             <w:pPr>
               <w:rPr>
-                <w:rFonts w:eastAsiaTheme="minorEastAsia" w:hint="eastAsia"/>
+                <w:rFonts w:eastAsiaTheme="minorEastAsia"/>
               </w:rPr>
             </w:pPr>
             <w:r>
@@ -2252,13 +2267,13 @@
           <w:p>
             <w:pPr>
               <w:rPr>
+                <w:rFonts w:eastAsiaTheme="minorEastAsia"/>
+              </w:rPr>
+            </w:pPr>
+            <w:r>
+              <w:rPr>
                 <w:rFonts w:eastAsiaTheme="minorEastAsia" w:hint="eastAsia"/>
               </w:rPr>
-            </w:pPr>
-            <w:r>
-              <w:rPr>
-                <w:rFonts w:eastAsiaTheme="minorEastAsia" w:hint="eastAsia"/>
-              </w:rPr>
               <w:t>CR8</w:t>
             </w:r>
           </w:p>
@@ -2270,7 +2285,7 @@
           <w:p>
             <w:pPr>
               <w:rPr>
-                <w:rFonts w:eastAsiaTheme="minorEastAsia" w:hint="eastAsia"/>
+                <w:rFonts w:eastAsiaTheme="minorEastAsia"/>
               </w:rPr>
             </w:pPr>
             <w:r>
@@ -2290,13 +2305,13 @@
           <w:p>
             <w:pPr>
               <w:rPr>
+                <w:rFonts w:eastAsiaTheme="minorEastAsia"/>
+              </w:rPr>
+            </w:pPr>
+            <w:r>
+              <w:rPr>
                 <w:rFonts w:eastAsiaTheme="minorEastAsia" w:hint="eastAsia"/>
               </w:rPr>
-            </w:pPr>
-            <w:r>
-              <w:rPr>
-                <w:rFonts w:eastAsiaTheme="minorEastAsia" w:hint="eastAsia"/>
-              </w:rPr>
               <w:t>CR9</w:t>
             </w:r>
           </w:p>
@@ -2308,7 +2323,7 @@
           <w:p>
             <w:pPr>
               <w:rPr>
-                <w:rFonts w:eastAsiaTheme="minorEastAsia" w:hint="eastAsia"/>
+                <w:rFonts w:eastAsiaTheme="minorEastAsia"/>
               </w:rPr>
             </w:pPr>
             <w:r>
@@ -2328,13 +2343,13 @@
           <w:p>
             <w:pPr>
               <w:rPr>
+                <w:rFonts w:eastAsiaTheme="minorEastAsia"/>
+              </w:rPr>
+            </w:pPr>
+            <w:r>
+              <w:rPr>
                 <w:rFonts w:eastAsiaTheme="minorEastAsia" w:hint="eastAsia"/>
               </w:rPr>
-            </w:pPr>
-            <w:r>
-              <w:rPr>
-                <w:rFonts w:eastAsiaTheme="minorEastAsia" w:hint="eastAsia"/>
-              </w:rPr>
               <w:t>CR10</w:t>
             </w:r>
           </w:p>
@@ -2346,7 +2361,7 @@
           <w:p>
             <w:pPr>
               <w:rPr>
-                <w:rFonts w:eastAsiaTheme="minorEastAsia" w:hint="eastAsia"/>
+                <w:rFonts w:eastAsiaTheme="minorEastAsia"/>
               </w:rPr>
             </w:pPr>
             <w:r>
@@ -2366,13 +2381,13 @@
           <w:p>
             <w:pPr>
               <w:rPr>
+                <w:rFonts w:eastAsiaTheme="minorEastAsia"/>
+              </w:rPr>
+            </w:pPr>
+            <w:r>
+              <w:rPr>
                 <w:rFonts w:eastAsiaTheme="minorEastAsia" w:hint="eastAsia"/>
               </w:rPr>
-            </w:pPr>
-            <w:r>
-              <w:rPr>
-                <w:rFonts w:eastAsiaTheme="minorEastAsia" w:hint="eastAsia"/>
-              </w:rPr>
               <w:t>CR11</w:t>
             </w:r>
           </w:p>
@@ -2384,7 +2399,7 @@
           <w:p>
             <w:pPr>
               <w:rPr>
-                <w:rFonts w:eastAsiaTheme="minorEastAsia" w:hint="eastAsia"/>
+                <w:rFonts w:eastAsiaTheme="minorEastAsia"/>
               </w:rPr>
             </w:pPr>
             <w:r>
@@ -2404,13 +2419,13 @@
           <w:p>
             <w:pPr>
               <w:rPr>
+                <w:rFonts w:eastAsiaTheme="minorEastAsia"/>
+              </w:rPr>
+            </w:pPr>
+            <w:r>
+              <w:rPr>
                 <w:rFonts w:eastAsiaTheme="minorEastAsia" w:hint="eastAsia"/>
               </w:rPr>
-            </w:pPr>
-            <w:r>
-              <w:rPr>
-                <w:rFonts w:eastAsiaTheme="minorEastAsia" w:hint="eastAsia"/>
-              </w:rPr>
               <w:t>CR12</w:t>
             </w:r>
           </w:p>
@@ -2422,7 +2437,7 @@
           <w:p>
             <w:pPr>
               <w:rPr>
-                <w:rFonts w:eastAsiaTheme="minorEastAsia" w:hint="eastAsia"/>
+                <w:rFonts w:eastAsiaTheme="minorEastAsia"/>
               </w:rPr>
             </w:pPr>
             <w:r>
@@ -2438,7 +2453,7 @@
     <w:p>
       <w:pPr>
         <w:rPr>
-          <w:rFonts w:eastAsiaTheme="minorEastAsia" w:hint="eastAsia"/>
+          <w:rFonts w:eastAsiaTheme="minorEastAsia"/>
           <w:lang w:val="en-US"/>
         </w:rPr>
       </w:pPr>
@@ -2503,7 +2518,7 @@
     <w:p>
       <w:pPr>
         <w:rPr>
-          <w:rFonts w:eastAsiaTheme="minorEastAsia" w:hint="eastAsia"/>
+          <w:rFonts w:eastAsiaTheme="minorEastAsia"/>
           <w:lang w:val="en-US"/>
         </w:rPr>
       </w:pPr>

</xml_diff>